<commit_message>
docs: rewrite ACL version history in first person
</commit_message>
<xml_diff>
--- a/packet-tracer/Controle-de-Acesso-ACL/PedroFerreira_2026-10-21_Relatorio-Projeto-ACL-3-Roteadores.docx
+++ b/packet-tracer/Controle-de-Acesso-ACL/PedroFerreira_2026-10-21_Relatorio-Projeto-ACL-3-Roteadores.docx
@@ -1310,17 +1310,17 @@
     </w:p>
     <w:p>
       <w:r>
-        <w:t>A leitura do DOCX Portuguese_4_5_6_Packet_Tracer_Configure_Numbered_Standard_IPv4_ACLs.docx define R1, R2 e R3, enlaces seriais, EIGRP e ACLs aplicadas em R2 e R3. Essa é a versão principal deste relatório e deve ser usada para entregar esta atividade.</w:t>
+        <w:t>Ao revisar o arquivo Portuguese_4_5_6_Packet_Tracer_Configure_Numbered_Standard_IPv4_ACLs.docx, confirmei que o enunciado define R1, R2 e R3, enlaces seriais, EIGRP e ACLs aplicadas em R2 e R3. Por isso, uso a versão de três roteadores como entrega principal desta atividade.</w:t>
       </w:r>
     </w:p>
     <w:p>
       <w:r>
-        <w:t>A imagem compartilhada na conversa mostra outra topologia: um único R1, quatro switches, PC0, PC1, PC2, Web Server e File Server. A cópia PedroFerreira_2026-10-21_Projeto-ACL-Literal-Visual.pkt preserva essa versão e confirma a ACL do R1: PC1 e Web Server alcançam o File Server, enquanto PC0 e PC2 recebem Destination host unreachable.</w:t>
+        <w:t>Durante a revisão com um colega de estudo, identifiquei uma segunda topologia: um único R1, quatro switches, PC0, PC1, PC2, Web Server e File Server. Mantive essa estrutura no arquivo PedroFerreira_2026-10-21_Projeto-ACL-Literal-Visual.pkt. Nessa versão, a ACL do R1 permite que PC1 e Web Server alcancem o File Server, enquanto PC0 e PC2 recebem Destination host unreachable.</w:t>
       </w:r>
     </w:p>
     <w:p>
       <w:r>
-        <w:t>A observação do colega está correta para a topologia visual de um roteador. Ela não substitui o enunciado do DOCX indicado, que exige três roteadores. As duas versões ficam separadas para que o histórico da divergência possa ser demonstrado sem misturar os critérios de avaliação.</w:t>
+        <w:t>Decidi manter as duas versões separadas. A versão de três roteadores atende ao DOCX indicado. A versão de um roteador registra a topologia visual encontrada durante a revisão e evita misturar critérios de atividades diferentes.</w:t>
       </w:r>
     </w:p>
     <w:p>

</xml_diff>

<commit_message>
docs: record DOCX and PKA inconsistencies
</commit_message>
<xml_diff>
--- a/packet-tracer/Controle-de-Acesso-ACL/PedroFerreira_2026-10-21_Relatorio-Projeto-ACL-3-Roteadores.docx
+++ b/packet-tracer/Controle-de-Acesso-ACL/PedroFerreira_2026-10-21_Relatorio-Projeto-ACL-3-Roteadores.docx
@@ -1328,6 +1328,29 @@
         <w:pStyle w:val="Heading1"/>
       </w:pPr>
       <w:r>
+        <w:t>Inconsistências verificadas nos arquivos</w:t>
+      </w:r>
+    </w:p>
+    <w:p>
+      <w:r>
+        <w:t>Também abri uma cópia de Portuguese_Configure_Named_Standard_IPv4_ACLs_pka.pka para comparar os materiais. O arquivo contém um único R1 modelo 1841, quatro switches 2960-24TT, PC0, PC1, PC2, Web Server e File Server. O R1 apresenta somente interfaces Ethernet e FastEthernet, sem portas seriais. A leitura da ACL retornou zero listas configuradas.</w:t>
+      </w:r>
+    </w:p>
+    <w:p>
+      <w:r>
+        <w:t>A versão visual concluída preserva essa mesma topologia e contém a ACL 1 no R1: permit host 192.168.20.4, permit host 192.168.100.100 e deny any. Os testes confirmaram acesso de PC1 e Web Server ao File Server e bloqueio de PC0 e PC2.</w:t>
+      </w:r>
+    </w:p>
+    <w:p>
+      <w:r>
+        <w:t>A versão principal apresenta sete dispositivos de usuário, três roteadores 2911, três enlaces seriais, EIGRP e ACL 1 em R2 e R3. A diferença está nos próprios arquivos de origem. Não encontrei evidência de que a topologia de um roteador seja uma versão incompleta da topologia de três roteadores.</w:t>
+      </w:r>
+    </w:p>
+    <w:p>
+      <w:pPr>
+        <w:pStyle w:val="Heading1"/>
+      </w:pPr>
+      <w:r>
         <w:t>Conclusão</w:t>
       </w:r>
     </w:p>

</xml_diff>